<commit_message>
[Ostendorf] Schmidl and Bolzius translated from the originals
Co-Authored-By: Claude Opus 5.5 <noreply@anthropic.com>
</commit_message>
<xml_diff>
--- a/work/ostendorf/ostendorf_robocza.docx
+++ b/work/ostendorf/ostendorf_robocza.docx
@@ -430,7 +430,7 @@
         <w:pStyle w:val="BodyText"/>
       </w:pPr>
       <w:r>
-        <w:t xml:space="preserve">To powiązanie pojawia się ponownie w kronice z 1554 roku, pozostawionej przez niemieckiego podróżnika Ulrica Schmidla, który dwie dekady wcześniej uczestniczył w wyprawie, która założyła Buenos Aires. Schmidl wspominał swoje pierwsze spotkania z rdzennym ludem Querandi przez pryzmat własnych założeń o Romach w krajach niemieckich. Pisząc dla publiczności zaciekawionej Amerykami, Schmidl niewątpliwie starał się uczynić czytelnym miejsce, które niewielu Europejczyków potrafiło sobie wyobrazić, a cóż dopiero go doświadczyć. Jego porównanie, choć zwięzłe, sugeruje, że zarówno mobilność Romów i Querandi, jak i postrzeganie ich jako obcych – nawet we własnych ojczyznach – funkcjonowały na tyle podobnie, by rzucić dla niemieckojęzycznych odbiorców światło na obie grupy innych i na nich samych. Jak to ujął, Querandi „nie mają w kraju własnego miejsca; wędrują po ziemi zupełnie jak</w:t>
+        <w:t xml:space="preserve">To powiązanie pojawia się ponownie w kronice z 1554 roku, pozostawionej przez niemieckiego podróżnika Ulrica Schmidla, który dwie dekady wcześniej uczestniczył w wyprawie, która założyła Buenos Aires. Schmidl wspominał swoje pierwsze spotkania z rdzennym ludem Querandi przez pryzmat własnych założeń o Romach w krajach niemieckich. Pisząc dla publiczności zaciekawionej Amerykami, Schmidl niewątpliwie starał się uczynić czytelnym miejsce, które niewielu Europejczyków potrafiło sobie wyobrazić, a cóż dopiero go doświadczyć. Jego porównanie, choć zwięzłe, sugeruje, że zarówno mobilność Romów i Querandi, jak i postrzeganie ich jako obcych – nawet we własnych ojczyznach – funkcjonowały na tyle podobnie, by rzucić dla niemieckojęzycznych odbiorców światło na obie grupy innych i na nich samych. Jak to ujął, Querandi „nie mają w tym kraju własnego stałego miejsca; wędrują po ziemi tak samo jak tu, w krajach niemieckich,</w:t>
       </w:r>
       <w:r>
         <w:t xml:space="preserve"> </w:t>
@@ -443,10 +443,7 @@
         <w:t xml:space="preserve">Zigeuner</w:t>
       </w:r>
       <w:r>
-        <w:t xml:space="preserve"> </w:t>
-      </w:r>
-      <w:r>
-        <w:t xml:space="preserve">tu, w krajach niemieckich”</w:t>
+        <w:t xml:space="preserve">”</w:t>
       </w:r>
       <w:r>
         <w:rPr>
@@ -1666,7 +1663,7 @@
         <w:pStyle w:val="BodyText"/>
       </w:pPr>
       <w:r>
-        <w:t xml:space="preserve">Dwaj osiemnastowieczni niemieccy imigranci pietyści w brytyjskiej Ameryce Północnej ponownie powiązali transatlantycką matrycę rasową ze środkowoeuropejską myślą antycygańską. Pierwszy z nich, Johann Bolzius, który przewodził pierwszej grupie imigrantów salzburskich w Georgii, doczekał się publikacji swojego opisu tego regionu z 1751 roku jako zachęcającej do osadnictwa relacji podróżniczej w Niemczech. Opisał w nim, jak tubylcy, „którzy czasami przemierzają nasze okolice, nie są lepsi od</w:t>
+        <w:t xml:space="preserve">Dwaj osiemnastowieczni niemieccy imigranci pietyści w brytyjskiej Ameryce Północnej ponownie powiązali transatlantycką matrycę rasową ze środkowoeuropejską myślą antycygańską. Pierwszy z nich, Johann Bolzius, który przewodził pierwszej grupie imigrantów salzburskich w Georgii, doczekał się publikacji swojego opisu tego regionu z 1751 roku jako zachęcającej do osadnictwa relacji podróżniczej w Niemczech. Opisał w nim, jak tubylcy, „którzy czasem włóczą się po naszych okolicach, nie są lepsi od</w:t>
       </w:r>
       <w:r>
         <w:t xml:space="preserve"> </w:t>
@@ -1682,7 +1679,7 @@
         <w:t xml:space="preserve"> </w:t>
       </w:r>
       <w:r>
-        <w:t xml:space="preserve">w kilku częściach Niemiec, [są] bardzo oddani pijaństwu i innym występkom, kradną konie z pastwisk, a czasem strzelają do wołów i krów, aby sprzedać kawałek mięsa albo dzwonki wiszące im u szyi”</w:t>
+        <w:t xml:space="preserve">w niektórych miejscach Niemiec, [są] bardzo oddani pijaństwu i innym występkom, kradną konie z pastwisk, a czasem zabijają strzałem woły i krowy dla kawałka mięsa albo dla dzwonka wiszącego im u szyi”</w:t>
       </w:r>
       <w:r>
         <w:rPr>
@@ -2696,7 +2693,7 @@
         <w:t xml:space="preserve"> </w:t>
       </w:r>
       <w:r>
-        <w:t xml:space="preserve">[tłum. z przekładu angielskiego autorki – przyp. tłum.] Oryginalny rękopis zdigitalizowała Württembergische Landesbibliothek w Stuttgarcie, https://digital.wlb-stuttgart.de/index.php?id=6&amp;tx_dlf%5Bid%5D=16324&amp;tx_dlf%5Bpage%5D=1.</w:t>
+        <w:t xml:space="preserve">[przekład z hiszpańskiego tekstu cytowanego wydania – przyp. tłum.] Oryginalny rękopis zdigitalizowała Württembergische Landesbibliothek w Stuttgarcie, https://digital.wlb-stuttgart.de/index.php?id=6&amp;tx_dlf%5Bid%5D=16324&amp;tx_dlf%5Bpage%5D=1.</w:t>
       </w:r>
     </w:p>
   </w:footnote>
@@ -3336,7 +3333,7 @@
         <w:t xml:space="preserve"> </w:t>
       </w:r>
       <w:r>
-        <w:t xml:space="preserve">[tłum. z przekładu angielskiego – przyp. tłum.]</w:t>
+        <w:t xml:space="preserve">[przekład z oryginału niemieckiego u Urlspergera, s. 979–980 – przyp. tłum.]</w:t>
       </w:r>
     </w:p>
   </w:footnote>

</xml_diff>